<commit_message>
added more attributes to services and fixed modal, table etc...
</commit_message>
<xml_diff>
--- a/документация/курсовая1.docx
+++ b/документация/курсовая1.docx
@@ -1198,64 +1198,26 @@
         <w:ind w:right="567" w:firstLine="709"/>
         <w:jc w:val="both"/>
         <w:rPr>
-          <w:color w:val="FF0000"/>
-        </w:rPr>
-      </w:pPr>
-      <w:r>
-        <w:rPr>
           <w:color w:val="000000"/>
         </w:rPr>
-        <w:t>Ежегодно, число автовладельцев, а соответственно</w:t>
-      </w:r>
+      </w:pPr>
       <w:r>
         <w:rPr>
           <w:color w:val="000000"/>
         </w:rPr>
-        <w:t xml:space="preserve"> и</w:t>
+        <w:t>В настоящее время авторынок в РФ претерпевает существенные изменения. Согласно данным аналитического агенства «Автостат» от 13.01.26, по итогам 2025 года было продано на 15,6% меньше легковых машин, по сравнению с 2024 годом</w:t>
       </w:r>
       <w:r>
         <w:rPr>
           <w:color w:val="000000"/>
         </w:rPr>
-        <w:t xml:space="preserve"> число автомобилей увеличивается</w:t>
+        <w:t>[1]</w:t>
       </w:r>
       <w:r>
         <w:rPr>
           <w:color w:val="000000"/>
         </w:rPr>
-        <w:t xml:space="preserve">. </w:t>
-      </w:r>
-      <w:r>
-        <w:rPr>
-          <w:color w:val="000000"/>
-        </w:rPr>
-        <w:t>В связи с этим возрастает потребность в услугах по техническому обслуживанию и ремонту автомобилей.</w:t>
-      </w:r>
-      <w:r>
-        <w:rPr>
-          <w:color w:val="FF0000"/>
-        </w:rPr>
-        <w:t xml:space="preserve"> </w:t>
-      </w:r>
-      <w:r>
-        <w:rPr>
-          <w:color w:val="FF0000"/>
-        </w:rPr>
-        <w:t xml:space="preserve">(рынок в стагнации, </w:t>
-      </w:r>
-      <w:proofErr w:type="gramStart"/>
-      <w:r>
-        <w:rPr>
-          <w:color w:val="FF0000"/>
-        </w:rPr>
-        <w:t>сказать</w:t>
-      </w:r>
-      <w:proofErr w:type="gramEnd"/>
-      <w:r>
-        <w:rPr>
-          <w:color w:val="FF0000"/>
-        </w:rPr>
-        <w:t xml:space="preserve"> что нет-сослаться на что-то аналитическое, типо сайта)</w:t>
+        <w:t>.</w:t>
       </w:r>
     </w:p>
     <w:p>
@@ -1266,17 +1228,53 @@
         </w:tabs>
         <w:suppressAutoHyphens/>
         <w:spacing w:line="360" w:lineRule="auto"/>
-        <w:ind w:right="567" w:firstLine="709"/>
-        <w:jc w:val="both"/>
+        <w:ind w:right="567"/>
+        <w:jc w:val="both"/>
+        <w:rPr>
+          <w:color w:val="FF0000"/>
+        </w:rPr>
+      </w:pPr>
+      <w:r>
         <w:rPr>
           <w:color w:val="000000"/>
         </w:rPr>
-      </w:pPr>
+        <w:t xml:space="preserve">В связи с этим, </w:t>
+      </w:r>
       <w:r>
         <w:rPr>
           <w:color w:val="000000"/>
         </w:rPr>
-        <w:t xml:space="preserve">Рост объема обращений в автосервисы приводит к увеличению нагрузки на персонал, усложнению различных процессов, например таких как учёт заказов и клиентов. В данных условиях, традиционные методы организации деятельности, такие как бумажный документооборот или разрозненные программные средства, становятся неэффективными, что приводит к различным недостаткам, например ошибкам при расчетах или низкой работоспособности. </w:t>
+        <w:t>возрастает</w:t>
+      </w:r>
+      <w:r>
+        <w:rPr>
+          <w:color w:val="000000"/>
+        </w:rPr>
+        <w:t xml:space="preserve"> </w:t>
+      </w:r>
+      <w:r>
+        <w:rPr>
+          <w:color w:val="000000"/>
+        </w:rPr>
+        <w:t>средний возраст самого автомобиля</w:t>
+      </w:r>
+      <w:r>
+        <w:rPr>
+          <w:color w:val="000000"/>
+        </w:rPr>
+        <w:t xml:space="preserve">, а также </w:t>
+      </w:r>
+      <w:r>
+        <w:rPr>
+          <w:color w:val="000000"/>
+        </w:rPr>
+        <w:t>средний возраст владения автомобилем</w:t>
+      </w:r>
+      <w:r>
+        <w:rPr>
+          <w:color w:val="000000"/>
+        </w:rPr>
+        <w:t>.</w:t>
       </w:r>
     </w:p>
     <w:p>
@@ -1297,25 +1295,7 @@
         <w:rPr>
           <w:color w:val="000000"/>
         </w:rPr>
-        <w:t>В следствие данных условий, внедрение информационной системы авто</w:t>
-      </w:r>
-      <w:r>
-        <w:rPr>
-          <w:color w:val="000000"/>
-        </w:rPr>
-        <w:t xml:space="preserve">ремонтной </w:t>
-      </w:r>
-      <w:r>
-        <w:rPr>
-          <w:color w:val="000000"/>
-        </w:rPr>
-        <w:t xml:space="preserve">мастерской имеет особую актуальность, за счет </w:t>
-      </w:r>
-      <w:r>
-        <w:rPr>
-          <w:color w:val="000000"/>
-        </w:rPr>
-        <w:t>своих функций, обспечивающих автоматизацию процессов приёма и обработки заказов, ведение клиентской базы, учет выполненных работ и используемых материалов, а также формирование отчётов.</w:t>
+        <w:t xml:space="preserve">Рост объема обращений в автосервисы приводит к увеличению нагрузки на персонал, усложнению различных процессов, например таких как учёт заказов и клиентов. В данных условиях, традиционные методы организации деятельности, такие как бумажный документооборот или разрозненные программные средства, становятся неэффективными, что приводит к различным недостаткам, например ошибкам при расчетах или низкой работоспособности. </w:t>
       </w:r>
     </w:p>
     <w:p>
@@ -1336,6 +1316,45 @@
         <w:rPr>
           <w:color w:val="000000"/>
         </w:rPr>
+        <w:t>В следствие данных условий, внедрение информационной системы авто</w:t>
+      </w:r>
+      <w:r>
+        <w:rPr>
+          <w:color w:val="000000"/>
+        </w:rPr>
+        <w:t xml:space="preserve">ремонтной </w:t>
+      </w:r>
+      <w:r>
+        <w:rPr>
+          <w:color w:val="000000"/>
+        </w:rPr>
+        <w:t xml:space="preserve">мастерской имеет особую актуальность, за счет </w:t>
+      </w:r>
+      <w:r>
+        <w:rPr>
+          <w:color w:val="000000"/>
+        </w:rPr>
+        <w:t>своих функций, обспечивающих автоматизацию процессов приёма и обработки заказов, ведение клиентской базы, учет выполненных работ и используемых материалов, а также формирование отчётов.</w:t>
+      </w:r>
+    </w:p>
+    <w:p>
+      <w:pPr>
+        <w:tabs>
+          <w:tab w:val="left" w:pos="6120"/>
+          <w:tab w:val="right" w:pos="9360"/>
+        </w:tabs>
+        <w:suppressAutoHyphens/>
+        <w:spacing w:line="360" w:lineRule="auto"/>
+        <w:ind w:right="567" w:firstLine="709"/>
+        <w:jc w:val="both"/>
+        <w:rPr>
+          <w:color w:val="000000"/>
+        </w:rPr>
+      </w:pPr>
+      <w:r>
+        <w:rPr>
+          <w:color w:val="000000"/>
+        </w:rPr>
         <w:t xml:space="preserve">Целью курсовой работы является </w:t>
       </w:r>
       <w:r>
@@ -1530,6 +1549,7 @@
         <w:jc w:val="both"/>
       </w:pPr>
       <w:r>
+        <w:lastRenderedPageBreak/>
         <w:t>реализовать приложение для работы с созданной базой данных (ОПК–3);</w:t>
       </w:r>
     </w:p>
@@ -1544,7 +1564,6 @@
         <w:jc w:val="both"/>
       </w:pPr>
       <w:r>
-        <w:lastRenderedPageBreak/>
         <w:t>провести тестирование реализованной системы;</w:t>
       </w:r>
     </w:p>
@@ -1640,27 +1659,9 @@
         <w:t>мастерская</w:t>
       </w:r>
       <w:r>
-        <w:t>(АМ)</w:t>
-      </w:r>
-      <w:r>
         <w:t xml:space="preserve"> </w:t>
       </w:r>
       <w:r>
-        <w:t>(</w:t>
-      </w:r>
-      <w:r>
-        <w:t xml:space="preserve">либо частный случай </w:t>
-      </w:r>
-      <w:r>
-        <w:t>СТО</w:t>
-      </w:r>
-      <w:r>
-        <w:t>, либо вообще не использовать СТО</w:t>
-      </w:r>
-      <w:r>
-        <w:t xml:space="preserve">) </w:t>
-      </w:r>
-      <w:r>
         <w:t xml:space="preserve">— </w:t>
       </w:r>
       <w:r>
@@ -1683,6 +1684,16 @@
         <w:jc w:val="both"/>
       </w:pPr>
       <w:r>
+        <w:t>Заявка — минимальный набор данных, необходимый для создания экземпляров сущностей «Клиент», «Автомобиль» и «Заявка». Является основой для создания Заказ-наряда.</w:t>
+      </w:r>
+    </w:p>
+    <w:p>
+      <w:pPr>
+        <w:spacing w:line="360" w:lineRule="auto"/>
+        <w:ind w:firstLine="851"/>
+        <w:jc w:val="both"/>
+      </w:pPr>
+      <w:r>
         <w:t>Заказ-наряд</w:t>
       </w:r>
       <w:r>
@@ -1717,6 +1728,26 @@
         <w:jc w:val="both"/>
       </w:pPr>
       <w:r>
+        <w:t>Комплектующие — запчасти, использующиеся при ремонте и обслуживании автомобиля.</w:t>
+      </w:r>
+    </w:p>
+    <w:p>
+      <w:pPr>
+        <w:spacing w:line="360" w:lineRule="auto"/>
+        <w:ind w:firstLine="851"/>
+        <w:jc w:val="both"/>
+      </w:pPr>
+      <w:r>
+        <w:t>Услуга — действия, направленные на диагностику, обслуживание или ремонт автомобиля.</w:t>
+      </w:r>
+    </w:p>
+    <w:p>
+      <w:pPr>
+        <w:spacing w:line="360" w:lineRule="auto"/>
+        <w:ind w:firstLine="851"/>
+        <w:jc w:val="both"/>
+      </w:pPr>
+      <w:r>
         <w:t>Мелкосрочный ремонт — совокупность операций, не требующих длительного</w:t>
       </w:r>
       <w:r>
@@ -1745,23 +1776,39 @@
         <w:t xml:space="preserve">ремонтной </w:t>
       </w:r>
       <w:r>
-        <w:t>мастерской работают несколько различных типов персонала: администратор, мастер-приёмщик, а также различные виды рабочего персонала.</w:t>
-      </w:r>
-    </w:p>
-    <w:p>
-      <w:pPr>
-        <w:spacing w:line="360" w:lineRule="auto"/>
-        <w:ind w:firstLine="851"/>
-        <w:jc w:val="both"/>
-      </w:pPr>
-      <w:r>
+        <w:t>мастерской работают несколько различных типов персонала: администратор, мастер-приёмщик,</w:t>
+      </w:r>
+      <w:r>
+        <w:t xml:space="preserve"> владелец,</w:t>
+      </w:r>
+      <w:r>
+        <w:t xml:space="preserve"> а также различные виды рабочего персонала.</w:t>
+      </w:r>
+    </w:p>
+    <w:p>
+      <w:pPr>
+        <w:spacing w:line="360" w:lineRule="auto"/>
+        <w:ind w:firstLine="851"/>
+        <w:jc w:val="both"/>
+      </w:pPr>
+      <w:r>
+        <w:lastRenderedPageBreak/>
         <w:t>Администратор</w:t>
       </w:r>
       <w:r>
         <w:t xml:space="preserve"> — </w:t>
       </w:r>
       <w:r>
-        <w:t>работник, отвечающий за приёмку клиентов, назначение времени записи клиента, а также за создание первичной заявки.</w:t>
+        <w:t>работник, отвечающий за</w:t>
+      </w:r>
+      <w:r>
+        <w:t xml:space="preserve"> обработку и создание заявок,</w:t>
+      </w:r>
+      <w:r>
+        <w:t xml:space="preserve"> приёмку клиентов, </w:t>
+      </w:r>
+      <w:r>
+        <w:t>а также принимание оплаты со стороны клиента.</w:t>
       </w:r>
     </w:p>
     <w:p>
@@ -1788,6 +1835,25 @@
       <w:r>
         <w:t>заказ-наряды, закрывает, а также подписывает их, так же, при наличии, заверяет печатью.</w:t>
       </w:r>
+      <w:r>
+        <w:t xml:space="preserve"> Также занимается закупкой комплектующих.</w:t>
+      </w:r>
+    </w:p>
+    <w:p>
+      <w:pPr>
+        <w:spacing w:line="360" w:lineRule="auto"/>
+        <w:ind w:firstLine="851"/>
+        <w:jc w:val="both"/>
+      </w:pPr>
+      <w:r>
+        <w:t>Менеджер</w:t>
+      </w:r>
+      <w:r>
+        <w:t>/</w:t>
+      </w:r>
+      <w:r>
+        <w:t>Владелец — человек, ответственный за добавление новых клиентов, филиалов, новых поставщиков и договоров.</w:t>
+      </w:r>
     </w:p>
     <w:p>
       <w:pPr>
@@ -1816,7 +1882,6 @@
         <w:jc w:val="both"/>
       </w:pPr>
       <w:r>
-        <w:lastRenderedPageBreak/>
         <w:t>Проведём анализ существующих аналогичных информационных систем с целью выделения основных плюсов и минусов этих систем. В качестве примеров были выбраны системы таких авто</w:t>
       </w:r>
       <w:r>
@@ -1964,6 +2029,7 @@
         <w:jc w:val="both"/>
       </w:pPr>
       <w:r>
+        <w:lastRenderedPageBreak/>
         <w:t>Рисунок 1 — информационная система</w:t>
       </w:r>
       <w:r>
@@ -1980,7 +2046,6 @@
         <w:rPr>
           <w:noProof/>
         </w:rPr>
-        <w:lastRenderedPageBreak/>
         <w:drawing>
           <wp:inline distT="0" distB="0" distL="0" distR="0" wp14:anchorId="0D5C539D" wp14:editId="1645BCCD">
             <wp:extent cx="5940425" cy="2992120"/>

</xml_diff>

<commit_message>
added checkbox to application modal
</commit_message>
<xml_diff>
--- a/документация/курсовая1.docx
+++ b/документация/курсовая1.docx
@@ -5845,6 +5845,9 @@
         <w:spacing w:line="360" w:lineRule="auto"/>
         <w:ind w:firstLine="709"/>
         <w:jc w:val="both"/>
+        <w:rPr>
+          <w:lang w:val="en-US"/>
+        </w:rPr>
       </w:pPr>
       <w:r>
         <w:t>Каждая группа акторов(пользователей) обозначается иконкой человечка, под которой записывается имя группы, а каждое из возможных действий изображается текстом в овале. Связи между акторами и действиями обозначаются стрелками, а если одно из действий является результатом другого, то над стрелкой указываются слова «</w:t>
@@ -5925,11 +5928,1080 @@
       <w:r>
         <w:t xml:space="preserve">1.2) </w:t>
       </w:r>
+      <w:r>
+        <w:t>Запись по телефону – пользователь может позвонить в соответствующий филиал и записаться на обслуживание с помощью разговора по телефону с администратором</w:t>
+      </w:r>
+      <w:r>
+        <w:t>;</w:t>
+      </w:r>
+    </w:p>
+    <w:p>
+      <w:pPr>
+        <w:spacing w:line="360" w:lineRule="auto"/>
+        <w:ind w:firstLine="709"/>
+        <w:jc w:val="both"/>
+      </w:pPr>
+      <w:r>
+        <w:t xml:space="preserve">1.3) </w:t>
+      </w:r>
+      <w:r>
+        <w:t>Просмотр услуг и информации о филиалах авторемонтной мастерской</w:t>
+      </w:r>
+      <w:r>
+        <w:t>;</w:t>
+      </w:r>
+    </w:p>
+    <w:p>
+      <w:pPr>
+        <w:spacing w:line="360" w:lineRule="auto"/>
+        <w:ind w:firstLine="709"/>
+        <w:jc w:val="both"/>
+      </w:pPr>
+      <w:r>
+        <w:t>1.4) Запись на основе оставленной заявки – пользователь может оставить свои данные, подтвердить их обработку нажатием на флажок, после чего отправить эту заявку администратору</w:t>
+      </w:r>
+      <w:r>
+        <w:t>.</w:t>
+      </w:r>
+    </w:p>
+    <w:p>
+      <w:pPr>
+        <w:spacing w:line="360" w:lineRule="auto"/>
+        <w:ind w:firstLine="709"/>
+        <w:jc w:val="both"/>
+      </w:pPr>
+      <w:r>
+        <w:t>2) Авторизованный пользователь:</w:t>
+      </w:r>
+    </w:p>
+    <w:p>
+      <w:pPr>
+        <w:spacing w:line="360" w:lineRule="auto"/>
+        <w:ind w:firstLine="709"/>
+        <w:jc w:val="both"/>
+        <w:rPr>
+          <w:lang w:val="en-US"/>
+        </w:rPr>
+      </w:pPr>
+      <w:r>
+        <w:t>2.1) Доступ к личному кабинету</w:t>
+      </w:r>
+      <w:r>
+        <w:rPr>
+          <w:lang w:val="en-US"/>
+        </w:rPr>
+        <w:t>;</w:t>
+      </w:r>
+    </w:p>
+    <w:p>
+      <w:pPr>
+        <w:spacing w:line="360" w:lineRule="auto"/>
+        <w:ind w:firstLine="709"/>
+        <w:jc w:val="both"/>
+      </w:pPr>
+      <w:r>
+        <w:t>2.2) Просмотр личных автомобилей – просмотр всех автомобилей, что были обслужены в нашей авторемотной мастерской</w:t>
+      </w:r>
+      <w:r>
+        <w:t>;</w:t>
+      </w:r>
+    </w:p>
+    <w:p>
+      <w:pPr>
+        <w:spacing w:line="360" w:lineRule="auto"/>
+        <w:ind w:firstLine="709"/>
+        <w:jc w:val="both"/>
+      </w:pPr>
+      <w:r>
+        <w:t xml:space="preserve">2.3) </w:t>
+      </w:r>
+      <w:r>
+        <w:t xml:space="preserve">Просмотр личных Заказ-нарядов – просмотр </w:t>
+      </w:r>
+      <w:r>
+        <w:t>ранее оказанных услуг</w:t>
+      </w:r>
+      <w:r>
+        <w:t>;</w:t>
+      </w:r>
+    </w:p>
+    <w:p>
+      <w:pPr>
+        <w:spacing w:line="360" w:lineRule="auto"/>
+        <w:ind w:firstLine="709"/>
+        <w:jc w:val="both"/>
+      </w:pPr>
+      <w:r>
+        <w:t xml:space="preserve">2.4) </w:t>
+      </w:r>
+      <w:r>
+        <w:t>Просмотр</w:t>
+      </w:r>
+      <w:r>
+        <w:t xml:space="preserve"> личных Заявок – просмотр историй обращения</w:t>
+      </w:r>
+      <w:r>
+        <w:t>;</w:t>
+      </w:r>
+    </w:p>
+    <w:p>
+      <w:pPr>
+        <w:spacing w:line="360" w:lineRule="auto"/>
+        <w:ind w:firstLine="709"/>
+        <w:jc w:val="both"/>
+      </w:pPr>
+      <w:r>
+        <w:rPr>
+          <w:lang w:val="en-US"/>
+        </w:rPr>
+        <w:t xml:space="preserve">2.5) </w:t>
+      </w:r>
+      <w:r>
+        <w:t>Редактирование личных данных</w:t>
+      </w:r>
+      <w:r>
+        <w:rPr>
+          <w:lang w:val="en-US"/>
+        </w:rPr>
+        <w:t>.</w:t>
+      </w:r>
+    </w:p>
+    <w:p>
+      <w:pPr>
+        <w:spacing w:line="360" w:lineRule="auto"/>
+        <w:ind w:firstLine="709"/>
+        <w:jc w:val="both"/>
+      </w:pPr>
+      <w:r>
+        <w:t>3)</w:t>
+      </w:r>
+      <w:r>
+        <w:rPr>
+          <w:lang w:val="en-US"/>
+        </w:rPr>
+        <w:t xml:space="preserve"> </w:t>
+      </w:r>
+      <w:r>
+        <w:t>Администратор:</w:t>
+      </w:r>
+    </w:p>
+    <w:p>
+      <w:pPr>
+        <w:spacing w:line="360" w:lineRule="auto"/>
+        <w:ind w:firstLine="709"/>
+        <w:jc w:val="both"/>
+      </w:pPr>
+      <w:r>
+        <w:t>3.1)</w:t>
+      </w:r>
+      <w:r>
+        <w:t xml:space="preserve"> Авторизация – администратор должен войти в свой аккаунт</w:t>
+      </w:r>
+      <w:r>
+        <w:t>;</w:t>
+      </w:r>
+    </w:p>
+    <w:p>
+      <w:pPr>
+        <w:spacing w:line="360" w:lineRule="auto"/>
+        <w:ind w:firstLine="709"/>
+        <w:jc w:val="both"/>
+      </w:pPr>
+      <w:r>
+        <w:t>3.</w:t>
+      </w:r>
+      <w:r>
+        <w:t>2</w:t>
+      </w:r>
+      <w:r>
+        <w:t>) Внесение клиента в клиентскую базу</w:t>
+      </w:r>
+      <w:r>
+        <w:t>;</w:t>
+      </w:r>
+    </w:p>
+    <w:p>
+      <w:pPr>
+        <w:spacing w:line="360" w:lineRule="auto"/>
+        <w:ind w:firstLine="709"/>
+        <w:jc w:val="both"/>
+      </w:pPr>
+      <w:r>
+        <w:t>3.</w:t>
+      </w:r>
+      <w:r>
+        <w:t>3</w:t>
+      </w:r>
+      <w:r>
+        <w:t>) Внесение автомобиля клиента в базу данных автомобилей</w:t>
+      </w:r>
+      <w:r>
+        <w:t>;</w:t>
+      </w:r>
+    </w:p>
+    <w:p>
+      <w:pPr>
+        <w:spacing w:line="360" w:lineRule="auto"/>
+        <w:ind w:firstLine="709"/>
+        <w:jc w:val="both"/>
+      </w:pPr>
+      <w:r>
+        <w:t>3.</w:t>
+      </w:r>
+      <w:r>
+        <w:t>4</w:t>
+      </w:r>
+      <w:r>
+        <w:t xml:space="preserve">) </w:t>
+      </w:r>
+      <w:r>
+        <w:t>Оформление заявок</w:t>
+      </w:r>
+      <w:r>
+        <w:t>;</w:t>
+      </w:r>
+    </w:p>
+    <w:p>
+      <w:pPr>
+        <w:spacing w:line="360" w:lineRule="auto"/>
+        <w:ind w:firstLine="709"/>
+        <w:jc w:val="both"/>
+      </w:pPr>
+      <w:r>
+        <w:t xml:space="preserve">3.5) </w:t>
+      </w:r>
+      <w:r>
+        <w:t>Просмотр и редактирование заявок</w:t>
+      </w:r>
+      <w:r>
+        <w:t>;</w:t>
+      </w:r>
+    </w:p>
+    <w:p>
+      <w:pPr>
+        <w:spacing w:line="360" w:lineRule="auto"/>
+        <w:ind w:firstLine="709"/>
+        <w:jc w:val="both"/>
+      </w:pPr>
+      <w:r>
+        <w:t xml:space="preserve">3.6) </w:t>
+      </w:r>
+      <w:r>
+        <w:t>Просмотр и редактирование клиентов</w:t>
+      </w:r>
+      <w:r>
+        <w:t>;</w:t>
+      </w:r>
+    </w:p>
+    <w:p>
+      <w:pPr>
+        <w:spacing w:line="360" w:lineRule="auto"/>
+        <w:ind w:firstLine="709"/>
+        <w:jc w:val="both"/>
+      </w:pPr>
+      <w:r>
+        <w:t xml:space="preserve">3.7) </w:t>
+      </w:r>
+      <w:r>
+        <w:t>Просмотр и редактирование автомобилей</w:t>
+      </w:r>
+      <w:r>
+        <w:t>;</w:t>
+      </w:r>
+    </w:p>
+    <w:p>
+      <w:pPr>
+        <w:spacing w:line="360" w:lineRule="auto"/>
+        <w:ind w:firstLine="709"/>
+        <w:jc w:val="both"/>
+        <w:rPr>
+          <w:lang w:val="en-US"/>
+        </w:rPr>
+      </w:pPr>
+      <w:r>
+        <w:rPr>
+          <w:lang w:val="en-US"/>
+        </w:rPr>
+        <w:t xml:space="preserve">4) </w:t>
+      </w:r>
+      <w:r>
+        <w:t>Мастер-приёмщик</w:t>
+      </w:r>
+      <w:r>
+        <w:rPr>
+          <w:lang w:val="en-US"/>
+        </w:rPr>
+        <w:t>:</w:t>
+      </w:r>
+    </w:p>
+    <w:p>
+      <w:pPr>
+        <w:spacing w:line="360" w:lineRule="auto"/>
+        <w:ind w:firstLine="709"/>
+        <w:jc w:val="both"/>
+      </w:pPr>
+      <w:r>
+        <w:lastRenderedPageBreak/>
+        <w:t>4.1</w:t>
+      </w:r>
+      <w:r>
+        <w:t>) Авторизация – мастер-приёмщик должен войти в свой аккаунт</w:t>
+      </w:r>
+      <w:r>
+        <w:t>;</w:t>
+      </w:r>
+    </w:p>
+    <w:p>
+      <w:pPr>
+        <w:spacing w:line="360" w:lineRule="auto"/>
+        <w:ind w:firstLine="709"/>
+        <w:jc w:val="both"/>
+      </w:pPr>
+      <w:r>
+        <w:t xml:space="preserve">4.2) </w:t>
+      </w:r>
+      <w:r>
+        <w:t>Создание заказ-нарядов</w:t>
+      </w:r>
+      <w:r>
+        <w:t>;</w:t>
+      </w:r>
+    </w:p>
+    <w:p>
+      <w:pPr>
+        <w:spacing w:line="360" w:lineRule="auto"/>
+        <w:ind w:firstLine="709"/>
+        <w:jc w:val="both"/>
+      </w:pPr>
+      <w:r>
+        <w:t>4.3) Просмотр и редактирование заказ-нарядов</w:t>
+      </w:r>
+      <w:r>
+        <w:t>;</w:t>
+      </w:r>
+    </w:p>
+    <w:p>
+      <w:pPr>
+        <w:spacing w:line="360" w:lineRule="auto"/>
+        <w:ind w:firstLine="709"/>
+        <w:jc w:val="both"/>
+        <w:rPr>
+          <w:lang w:val="en-US"/>
+        </w:rPr>
+      </w:pPr>
+      <w:r>
+        <w:rPr>
+          <w:lang w:val="en-US"/>
+        </w:rPr>
+        <w:t xml:space="preserve">4.4) </w:t>
+      </w:r>
+      <w:r>
+        <w:t>Внесение и удаление поставщиков</w:t>
+      </w:r>
+      <w:r>
+        <w:rPr>
+          <w:lang w:val="en-US"/>
+        </w:rPr>
+        <w:t>;</w:t>
+      </w:r>
+    </w:p>
+    <w:p>
+      <w:pPr>
+        <w:spacing w:line="360" w:lineRule="auto"/>
+        <w:ind w:firstLine="709"/>
+        <w:jc w:val="both"/>
+      </w:pPr>
+      <w:r>
+        <w:t xml:space="preserve">4.5) </w:t>
+      </w:r>
+      <w:r>
+        <w:t>Внесение, редактирование и удаление договоров</w:t>
+      </w:r>
+      <w:r>
+        <w:t>;</w:t>
+      </w:r>
+    </w:p>
+    <w:p>
+      <w:pPr>
+        <w:spacing w:line="360" w:lineRule="auto"/>
+        <w:ind w:firstLine="709"/>
+        <w:jc w:val="both"/>
+      </w:pPr>
+      <w:r>
+        <w:t>5) Владелец</w:t>
+      </w:r>
+      <w:r>
+        <w:rPr>
+          <w:lang w:val="en-US"/>
+        </w:rPr>
+        <w:t>/</w:t>
+      </w:r>
+      <w:r>
+        <w:t>менеджер:</w:t>
+      </w:r>
+    </w:p>
+    <w:p>
+      <w:pPr>
+        <w:spacing w:line="360" w:lineRule="auto"/>
+        <w:ind w:firstLine="709"/>
+        <w:jc w:val="both"/>
+      </w:pPr>
+      <w:r>
+        <w:t>5.1) Авторизация</w:t>
+      </w:r>
+      <w:r>
+        <w:t xml:space="preserve"> ;</w:t>
+      </w:r>
+    </w:p>
+    <w:p>
+      <w:pPr>
+        <w:spacing w:line="360" w:lineRule="auto"/>
+        <w:ind w:firstLine="709"/>
+        <w:jc w:val="both"/>
+      </w:pPr>
+      <w:r>
+        <w:t>5.</w:t>
+      </w:r>
+      <w:r>
+        <w:t>2</w:t>
+      </w:r>
+      <w:r>
+        <w:t>) Просмотр</w:t>
+      </w:r>
+      <w:r>
+        <w:t xml:space="preserve"> заказ-нарядов</w:t>
+      </w:r>
+      <w:r>
+        <w:t>;</w:t>
+      </w:r>
+    </w:p>
+    <w:p>
+      <w:pPr>
+        <w:spacing w:line="360" w:lineRule="auto"/>
+        <w:ind w:firstLine="709"/>
+        <w:jc w:val="both"/>
+      </w:pPr>
+      <w:r>
+        <w:t>5.</w:t>
+      </w:r>
+      <w:r>
+        <w:t>3</w:t>
+      </w:r>
+      <w:r>
+        <w:t>) Просмотр</w:t>
+      </w:r>
+      <w:r>
+        <w:t xml:space="preserve"> заявок</w:t>
+      </w:r>
+      <w:r>
+        <w:t>;</w:t>
+      </w:r>
+    </w:p>
+    <w:p>
+      <w:pPr>
+        <w:spacing w:line="360" w:lineRule="auto"/>
+        <w:ind w:firstLine="709"/>
+        <w:jc w:val="both"/>
+      </w:pPr>
+      <w:r>
+        <w:t>5.</w:t>
+      </w:r>
+      <w:r>
+        <w:t>4</w:t>
+      </w:r>
+      <w:r>
+        <w:t>) Просмотр</w:t>
+      </w:r>
+      <w:r>
+        <w:t xml:space="preserve"> базы клиентов</w:t>
+      </w:r>
+      <w:r>
+        <w:t>;</w:t>
+      </w:r>
+    </w:p>
+    <w:p>
+      <w:pPr>
+        <w:spacing w:line="360" w:lineRule="auto"/>
+        <w:ind w:firstLine="709"/>
+        <w:jc w:val="both"/>
+      </w:pPr>
+      <w:r>
+        <w:t>5.</w:t>
+      </w:r>
+      <w:r>
+        <w:t>5</w:t>
+      </w:r>
+      <w:r>
+        <w:t>) Просмотр</w:t>
+      </w:r>
+      <w:r>
+        <w:t xml:space="preserve"> базы данных автомобилей</w:t>
+      </w:r>
+      <w:r>
+        <w:t>;</w:t>
+      </w:r>
+    </w:p>
+    <w:p>
+      <w:pPr>
+        <w:spacing w:line="360" w:lineRule="auto"/>
+        <w:ind w:firstLine="709"/>
+        <w:jc w:val="both"/>
+      </w:pPr>
+      <w:r>
+        <w:t>5.</w:t>
+      </w:r>
+      <w:r>
+        <w:t>6</w:t>
+      </w:r>
+      <w:r>
+        <w:t>) Просмотр</w:t>
+      </w:r>
+      <w:r>
+        <w:t>, добавление и редактирование персонала</w:t>
+      </w:r>
+      <w:r>
+        <w:t>;</w:t>
+      </w:r>
+    </w:p>
+    <w:p>
+      <w:pPr>
+        <w:spacing w:line="360" w:lineRule="auto"/>
+        <w:ind w:firstLine="709"/>
+        <w:jc w:val="both"/>
+      </w:pPr>
+      <w:r>
+        <w:t>5.</w:t>
+      </w:r>
+      <w:r>
+        <w:t>7</w:t>
+      </w:r>
+      <w:r>
+        <w:t>) Просмотр</w:t>
+      </w:r>
+      <w:r>
+        <w:t>, добавление и редактирование филиалов</w:t>
+      </w:r>
+      <w:r>
+        <w:t>;</w:t>
+      </w:r>
+    </w:p>
+    <w:p>
+      <w:pPr>
+        <w:spacing w:line="360" w:lineRule="auto"/>
+        <w:ind w:firstLine="709"/>
+        <w:jc w:val="both"/>
+      </w:pPr>
+      <w:r>
+        <w:t>5.</w:t>
+      </w:r>
+      <w:r>
+        <w:t>8</w:t>
+      </w:r>
+      <w:r>
+        <w:t>) Просмотр</w:t>
+      </w:r>
+      <w:r>
+        <w:t>, добавление и удаление поставщиков</w:t>
+      </w:r>
+      <w:r>
+        <w:t>;</w:t>
+      </w:r>
+    </w:p>
+    <w:p>
+      <w:pPr>
+        <w:spacing w:line="360" w:lineRule="auto"/>
+        <w:ind w:firstLine="709"/>
+        <w:jc w:val="both"/>
+      </w:pPr>
+      <w:r>
+        <w:t>5.</w:t>
+      </w:r>
+      <w:r>
+        <w:t>9</w:t>
+      </w:r>
+      <w:r>
+        <w:t>) Просмотр, добавление</w:t>
+      </w:r>
+      <w:r>
+        <w:t>, редактирование и удаление договоров</w:t>
+      </w:r>
+      <w:r>
+        <w:t>.</w:t>
+      </w:r>
+    </w:p>
+    <w:p>
+      <w:pPr>
+        <w:spacing w:line="360" w:lineRule="auto"/>
+        <w:ind w:firstLine="709"/>
+        <w:jc w:val="both"/>
+      </w:pPr>
+      <w:r>
+        <w:t xml:space="preserve">Диаграмма представлена на рисунке </w:t>
+      </w:r>
+      <w:r>
+        <w:rPr>
+          <w:color w:val="FF0000"/>
+          <w:lang w:val="en-US"/>
+        </w:rPr>
+        <w:t>x</w:t>
+      </w:r>
+      <w:r>
+        <w:t>.</w:t>
+      </w:r>
+    </w:p>
+    <w:p>
+      <w:pPr>
+        <w:spacing w:line="360" w:lineRule="auto"/>
+        <w:jc w:val="both"/>
+      </w:pPr>
+      <w:r>
+        <w:drawing>
+          <wp:inline distT="0" distB="0" distL="0" distR="0" wp14:anchorId="3169BC8C" wp14:editId="2B995011">
+            <wp:extent cx="5940425" cy="2164715"/>
+            <wp:effectExtent l="0" t="0" r="3175" b="6985"/>
+            <wp:docPr id="14" name="Рисунок 14"/>
+            <wp:cNvGraphicFramePr>
+              <a:graphicFrameLocks xmlns:a="http://schemas.openxmlformats.org/drawingml/2006/main" noChangeAspect="1"/>
+            </wp:cNvGraphicFramePr>
+            <a:graphic xmlns:a="http://schemas.openxmlformats.org/drawingml/2006/main">
+              <a:graphicData uri="http://schemas.openxmlformats.org/drawingml/2006/picture">
+                <pic:pic xmlns:pic="http://schemas.openxmlformats.org/drawingml/2006/picture">
+                  <pic:nvPicPr>
+                    <pic:cNvPr id="1" name=""/>
+                    <pic:cNvPicPr/>
+                  </pic:nvPicPr>
+                  <pic:blipFill>
+                    <a:blip r:embed="rId15">
+                      <a:extLst>
+                        <a:ext uri="{96DAC541-7B7A-43D3-8B79-37D633B846F1}">
+                          <asvg:svgBlip xmlns:asvg="http://schemas.microsoft.com/office/drawing/2016/SVG/main" r:embed="rId16"/>
+                        </a:ext>
+                      </a:extLst>
+                    </a:blip>
+                    <a:stretch>
+                      <a:fillRect/>
+                    </a:stretch>
+                  </pic:blipFill>
+                  <pic:spPr>
+                    <a:xfrm>
+                      <a:off x="0" y="0"/>
+                      <a:ext cx="5940425" cy="2164715"/>
+                    </a:xfrm>
+                    <a:prstGeom prst="rect">
+                      <a:avLst/>
+                    </a:prstGeom>
+                  </pic:spPr>
+                </pic:pic>
+              </a:graphicData>
+            </a:graphic>
+          </wp:inline>
+        </w:drawing>
+      </w:r>
+    </w:p>
+    <w:p>
+      <w:pPr>
+        <w:spacing w:line="360" w:lineRule="auto"/>
+        <w:ind w:firstLine="709"/>
+        <w:jc w:val="both"/>
+      </w:pPr>
+      <w:r>
+        <w:t>Рисунок  — диаграмма вариантов использования информационной системы «Авторемонтная мастерская»</w:t>
+      </w:r>
+    </w:p>
+    <w:p>
+      <w:pPr>
+        <w:spacing w:line="360" w:lineRule="auto"/>
+        <w:ind w:firstLine="709"/>
+        <w:jc w:val="both"/>
+      </w:pPr>
+      <w:r>
+        <w:t>3.3. Диаграмма последовательности</w:t>
+      </w:r>
+    </w:p>
+    <w:p>
+      <w:pPr>
+        <w:spacing w:line="360" w:lineRule="auto"/>
+        <w:ind w:firstLine="709"/>
+        <w:jc w:val="both"/>
+      </w:pPr>
+      <w:r>
+        <w:t xml:space="preserve">Диаграммы последовательности отражают поток событий, происходящих в рамках варианта использования. На этих диаграммах изображаются только те объекты, которые непосредственно участвуют во взаимодействии, так как ключевым моментом является именно динамика взаимодействия объектов во времени и не используются возможные статические ассоциации с другими объектами. </w:t>
+      </w:r>
+    </w:p>
+    <w:p>
+      <w:pPr>
+        <w:spacing w:line="360" w:lineRule="auto"/>
+        <w:ind w:firstLine="709"/>
+        <w:jc w:val="both"/>
+      </w:pPr>
+      <w:r>
+        <w:t>В данной диаграмме последовательности</w:t>
+      </w:r>
+      <w:r>
+        <w:t xml:space="preserve">, которая изображена на рисунке </w:t>
+      </w:r>
+      <w:r>
+        <w:rPr>
+          <w:color w:val="FF0000"/>
+          <w:lang w:val="en-US"/>
+        </w:rPr>
+        <w:t>x</w:t>
+      </w:r>
+      <w:r>
+        <w:t>,</w:t>
+      </w:r>
+      <w:r>
+        <w:t xml:space="preserve"> главным акт</w:t>
+      </w:r>
+      <w:r>
+        <w:t>о</w:t>
+      </w:r>
+      <w:r>
+        <w:t>ром является пользователь, который</w:t>
+      </w:r>
+      <w:r>
+        <w:t xml:space="preserve"> оставляет заявку на сайте</w:t>
+      </w:r>
+      <w:r>
+        <w:t>.</w:t>
+      </w:r>
+    </w:p>
+    <w:p>
+      <w:pPr>
+        <w:spacing w:line="360" w:lineRule="auto"/>
+        <w:jc w:val="both"/>
+      </w:pPr>
+      <w:r>
+        <w:lastRenderedPageBreak/>
+        <w:drawing>
+          <wp:inline distT="0" distB="0" distL="0" distR="0" wp14:anchorId="331E87DB" wp14:editId="48AEB103">
+            <wp:extent cx="5940425" cy="8174990"/>
+            <wp:effectExtent l="0" t="0" r="3175" b="0"/>
+            <wp:docPr id="15" name="Рисунок 15"/>
+            <wp:cNvGraphicFramePr>
+              <a:graphicFrameLocks xmlns:a="http://schemas.openxmlformats.org/drawingml/2006/main" noChangeAspect="1"/>
+            </wp:cNvGraphicFramePr>
+            <a:graphic xmlns:a="http://schemas.openxmlformats.org/drawingml/2006/main">
+              <a:graphicData uri="http://schemas.openxmlformats.org/drawingml/2006/picture">
+                <pic:pic xmlns:pic="http://schemas.openxmlformats.org/drawingml/2006/picture">
+                  <pic:nvPicPr>
+                    <pic:cNvPr id="1" name=""/>
+                    <pic:cNvPicPr/>
+                  </pic:nvPicPr>
+                  <pic:blipFill>
+                    <a:blip r:embed="rId17">
+                      <a:extLst>
+                        <a:ext uri="{96DAC541-7B7A-43D3-8B79-37D633B846F1}">
+                          <asvg:svgBlip xmlns:asvg="http://schemas.microsoft.com/office/drawing/2016/SVG/main" r:embed="rId18"/>
+                        </a:ext>
+                      </a:extLst>
+                    </a:blip>
+                    <a:stretch>
+                      <a:fillRect/>
+                    </a:stretch>
+                  </pic:blipFill>
+                  <pic:spPr>
+                    <a:xfrm>
+                      <a:off x="0" y="0"/>
+                      <a:ext cx="5940425" cy="8174990"/>
+                    </a:xfrm>
+                    <a:prstGeom prst="rect">
+                      <a:avLst/>
+                    </a:prstGeom>
+                  </pic:spPr>
+                </pic:pic>
+              </a:graphicData>
+            </a:graphic>
+          </wp:inline>
+        </w:drawing>
+      </w:r>
+    </w:p>
+    <w:p>
+      <w:pPr>
+        <w:spacing w:line="360" w:lineRule="auto"/>
+        <w:ind w:firstLine="709"/>
+        <w:jc w:val="both"/>
+      </w:pPr>
+      <w:r>
+        <w:t>Рисунок — диаграмма последовательностей информационной системы «Авторемонтная мастерская»</w:t>
+      </w:r>
+    </w:p>
+    <w:p>
+      <w:pPr>
+        <w:spacing w:line="360" w:lineRule="auto"/>
+        <w:ind w:firstLine="709"/>
+        <w:jc w:val="both"/>
+      </w:pPr>
+    </w:p>
+    <w:p>
+      <w:pPr>
+        <w:spacing w:line="360" w:lineRule="auto"/>
+        <w:ind w:firstLine="709"/>
+        <w:jc w:val="both"/>
+      </w:pPr>
+      <w:r>
+        <w:rPr>
+          <w:lang w:val="en-US"/>
+        </w:rPr>
+        <w:lastRenderedPageBreak/>
+        <w:t xml:space="preserve">3.4. </w:t>
+      </w:r>
+      <w:r>
+        <w:t>Выбор средств реализации</w:t>
+      </w:r>
+    </w:p>
+    <w:p>
+      <w:pPr>
+        <w:spacing w:line="360" w:lineRule="auto"/>
+        <w:ind w:firstLine="709"/>
+        <w:jc w:val="both"/>
+      </w:pPr>
+      <w:r>
+        <w:t xml:space="preserve">Для реализации информационной системы был выбран язык программирования </w:t>
+      </w:r>
+      <w:r>
+        <w:rPr>
+          <w:lang w:val="en-US"/>
+        </w:rPr>
+        <w:t>Javascript</w:t>
+      </w:r>
+      <w:r>
+        <w:t xml:space="preserve">, </w:t>
+      </w:r>
+      <w:r>
+        <w:t xml:space="preserve">а также его фреймворк </w:t>
+      </w:r>
+      <w:r>
+        <w:rPr>
+          <w:lang w:val="en-US"/>
+        </w:rPr>
+        <w:t>Express</w:t>
+      </w:r>
+      <w:r>
+        <w:t xml:space="preserve"> – для реализации серверной части</w:t>
+      </w:r>
+      <w:r>
+        <w:t xml:space="preserve"> </w:t>
+      </w:r>
+      <w:r>
+        <w:t xml:space="preserve">и библиотека </w:t>
+      </w:r>
+      <w:r>
+        <w:rPr>
+          <w:lang w:val="en-US"/>
+        </w:rPr>
+        <w:t>React</w:t>
+      </w:r>
+      <w:r>
+        <w:t xml:space="preserve"> – для реализации клиентской части.</w:t>
+      </w:r>
+    </w:p>
+    <w:p>
+      <w:pPr>
+        <w:spacing w:line="360" w:lineRule="auto"/>
+        <w:ind w:firstLine="851"/>
+        <w:jc w:val="both"/>
+      </w:pPr>
+      <w:r>
+        <w:t>JavaScript — мультипарадигменный язык программирования</w:t>
+      </w:r>
+      <w:r>
+        <w:t xml:space="preserve"> </w:t>
+      </w:r>
+      <w:r>
+        <w:t>с динамической типизацией. Поддерживает объектно-ориентированный, императивный и функциональный стили.</w:t>
+      </w:r>
+      <w:r>
+        <w:t xml:space="preserve"> </w:t>
+      </w:r>
+    </w:p>
+    <w:p>
+      <w:pPr>
+        <w:spacing w:line="360" w:lineRule="auto"/>
+        <w:ind w:firstLine="851"/>
+        <w:jc w:val="both"/>
+      </w:pPr>
+      <w:r>
+        <w:t>JavaScript-фреймворки являются неотъемлемой частью современной веб-разработки,</w:t>
+      </w:r>
+      <w:r>
+        <w:t xml:space="preserve"> </w:t>
+      </w:r>
+      <w:r>
+        <w:t>предоставляя разработчикам проверенные и протестированные</w:t>
+      </w:r>
+      <w:r>
+        <w:t xml:space="preserve"> </w:t>
+      </w:r>
+      <w:r>
+        <w:t>инструменты для создания масштабируемых и интерактивных веб-приложений.</w:t>
+      </w:r>
+    </w:p>
+    <w:p>
+      <w:pPr>
+        <w:spacing w:line="360" w:lineRule="auto"/>
+        <w:ind w:firstLine="851"/>
+        <w:jc w:val="both"/>
+      </w:pPr>
+      <w:r>
+        <w:t xml:space="preserve">Express </w:t>
+      </w:r>
+      <w:r>
+        <w:t>(версия 4.</w:t>
+      </w:r>
+      <w:r>
+        <w:t>6.</w:t>
+      </w:r>
+      <w:r>
+        <w:t xml:space="preserve">1) </w:t>
+      </w:r>
+      <w:r>
+        <w:t>– фреймворк, написанный на языке JavaScript, который</w:t>
+      </w:r>
+      <w:r>
+        <w:t xml:space="preserve"> </w:t>
+      </w:r>
+      <w:r>
+        <w:t>применяют в разработке бизнес-логики мобильных приложений и сайтов.</w:t>
+      </w:r>
+      <w:r>
+        <w:t xml:space="preserve"> </w:t>
+      </w:r>
+      <w:r>
+        <w:t>Express работает в Node.js – среде выполнения кода для языка JavaScript.</w:t>
+      </w:r>
+      <w:r>
+        <w:t xml:space="preserve"> </w:t>
+      </w:r>
+      <w:r>
+        <w:t>Express предоставляет ряд готовых абстракций, которые упрощают создание</w:t>
+      </w:r>
+      <w:r>
+        <w:t xml:space="preserve"> </w:t>
+      </w:r>
+      <w:r>
+        <w:t>сервера и серверной логики.</w:t>
+      </w:r>
+      <w:r>
+        <w:t xml:space="preserve"> </w:t>
+      </w:r>
+      <w:r>
+        <w:t>Он предоставляет набор инструментов для создания маршрутов, обработки запросов и ответов, управления сессиями, работу с базами данных и многое другое</w:t>
+      </w:r>
+      <w:r>
+        <w:t>.</w:t>
+      </w:r>
+    </w:p>
+    <w:p>
+      <w:pPr>
+        <w:spacing w:line="360" w:lineRule="auto"/>
+        <w:ind w:firstLine="851"/>
+        <w:jc w:val="both"/>
+      </w:pPr>
+      <w:r>
+        <w:t>Node.js идеально подходит для разработки серверных приложений, которым нужно одновременно обрабатывать несколько запросов, не перегружая систему. К тому же, благодаря асинхронной структуре Node.js обеспечивает стабильное соединение между клиентской и серверной частями приложения.</w:t>
+      </w:r>
+    </w:p>
+    <w:p>
+      <w:pPr>
+        <w:spacing w:line="360" w:lineRule="auto"/>
+        <w:ind w:firstLine="851"/>
+        <w:jc w:val="both"/>
+      </w:pPr>
+      <w:r>
+        <w:t xml:space="preserve">React </w:t>
+      </w:r>
+      <w:r>
+        <w:t xml:space="preserve">(версия </w:t>
+      </w:r>
+      <w:r>
+        <w:t>19.2.5</w:t>
+      </w:r>
+      <w:r>
+        <w:t xml:space="preserve">) </w:t>
+      </w:r>
+      <w:r>
+        <w:t>— это декларативная, эффективная и гибкая JavaScript-библиотека для создания пользовательских интерфейсов.</w:t>
+      </w:r>
+      <w:r>
+        <w:t xml:space="preserve"> </w:t>
+      </w:r>
+      <w:r>
+        <w:t>React решает задачу быстродействия приложения, делая его более быстрым и менее ресурсоемким благодаря использованию виртуального DOM. DOM (Document Object Model) — это структура веб-страницы, содержащая все элементы (текст, изображения, кнопки и т. д.), с которыми пользователь может взаимодействовать.</w:t>
+      </w:r>
+    </w:p>
+    <w:p>
+      <w:pPr>
+        <w:spacing w:line="360" w:lineRule="auto"/>
+        <w:ind w:firstLine="851"/>
+        <w:jc w:val="both"/>
+      </w:pPr>
+      <w:r>
+        <w:t xml:space="preserve">Также </w:t>
+      </w:r>
+      <w:r>
+        <w:t xml:space="preserve">для разработки </w:t>
+      </w:r>
+      <w:r>
+        <w:t>веб-интерфейс</w:t>
+      </w:r>
+      <w:r>
+        <w:t xml:space="preserve">а использовались </w:t>
+      </w:r>
+      <w:r>
+        <w:t>язык разметки HTML</w:t>
+      </w:r>
+      <w:r>
+        <w:t xml:space="preserve"> и язык </w:t>
+      </w:r>
+      <w:r>
+        <w:t>CSS.</w:t>
+      </w:r>
+    </w:p>
+    <w:p>
+      <w:pPr>
+        <w:spacing w:line="360" w:lineRule="auto"/>
+        <w:ind w:firstLine="851"/>
+        <w:jc w:val="both"/>
+      </w:pPr>
+      <w:r>
+        <w:t>В качестве среды разработки была выбрана среда разработки Visual Studio Code 1.</w:t>
+      </w:r>
+      <w:r>
+        <w:t>122</w:t>
+      </w:r>
+      <w:r>
+        <w:t>.1.</w:t>
+      </w:r>
+    </w:p>
+    <w:p>
+      <w:pPr>
+        <w:spacing w:line="360" w:lineRule="auto"/>
+        <w:ind w:firstLine="851"/>
+        <w:jc w:val="both"/>
+      </w:pPr>
+      <w:r>
+        <w:t>3.5. Реализация серверной части</w:t>
+      </w:r>
+    </w:p>
+    <w:p>
+      <w:pPr>
+        <w:spacing w:line="360" w:lineRule="auto"/>
+        <w:ind w:firstLine="851"/>
+        <w:jc w:val="both"/>
+      </w:pPr>
+    </w:p>
+    <w:p>
+      <w:pPr>
+        <w:spacing w:line="360" w:lineRule="auto"/>
+        <w:ind w:firstLine="709"/>
+        <w:jc w:val="both"/>
+      </w:pPr>
     </w:p>
     <w:sectPr>
-      <w:footerReference w:type="even" r:id="rId15"/>
-      <w:footerReference w:type="default" r:id="rId16"/>
-      <w:footerReference w:type="first" r:id="rId17"/>
+      <w:footerReference w:type="even" r:id="rId19"/>
+      <w:footerReference w:type="default" r:id="rId20"/>
+      <w:footerReference w:type="first" r:id="rId21"/>
       <w:pgSz w:w="11906" w:h="16838"/>
       <w:pgMar w:top="1134" w:right="850" w:bottom="1134" w:left="1701" w:header="709" w:footer="709" w:gutter="0"/>
       <w:cols w:space="708"/>

</xml_diff>